<commit_message>
easier final prob for day 2
</commit_message>
<xml_diff>
--- a/Homework/EandC/EandC_InClass2.docx
+++ b/Homework/EandC/EandC_InClass2.docx
@@ -831,234 +831,161 @@
           <w:rFonts w:ascii="FreeMono" w:hAnsi="FreeMono"/>
           <w:sz w:val="28"/>
         </w:rPr>
-        <w:t>(define make-weird-counter</w:t>
-      </w:r>
-    </w:p>
-    <w:p>
-      <w:pPr>
-        <w:pStyle w:val="Normal"/>
-        <w:rPr>
-          <w:rFonts w:ascii="FreeMono" w:hAnsi="FreeMono"/>
-        </w:rPr>
-      </w:pPr>
-      <w:r>
-        <w:rPr>
-          <w:rFonts w:ascii="FreeMono" w:hAnsi="FreeMono"/>
-          <w:sz w:val="28"/>
-        </w:rPr>
-        <w:t xml:space="preserve">  </w:t>
-      </w:r>
-      <w:r>
-        <w:rPr>
-          <w:rFonts w:ascii="FreeMono" w:hAnsi="FreeMono"/>
-          <w:sz w:val="28"/>
-        </w:rPr>
-        <w:t>(let ((supply 5)) ; think about how many times this let is run</w:t>
-      </w:r>
-    </w:p>
-    <w:p>
-      <w:pPr>
-        <w:pStyle w:val="Normal"/>
-        <w:rPr>
-          <w:rFonts w:ascii="FreeMono" w:hAnsi="FreeMono"/>
-        </w:rPr>
-      </w:pPr>
-      <w:r>
-        <w:rPr>
-          <w:rFonts w:ascii="FreeMono" w:hAnsi="FreeMono"/>
-          <w:sz w:val="28"/>
-        </w:rPr>
-        <w:t xml:space="preserve">    </w:t>
-      </w:r>
-      <w:r>
-        <w:rPr>
-          <w:rFonts w:ascii="FreeMono" w:hAnsi="FreeMono"/>
-          <w:sz w:val="28"/>
-        </w:rPr>
-        <w:t>(lambda ()</w:t>
-      </w:r>
-    </w:p>
-    <w:p>
-      <w:pPr>
-        <w:pStyle w:val="Normal"/>
-        <w:rPr>
-          <w:rFonts w:ascii="FreeMono" w:hAnsi="FreeMono"/>
-        </w:rPr>
-      </w:pPr>
-      <w:r>
-        <w:rPr>
-          <w:rFonts w:ascii="FreeMono" w:hAnsi="FreeMono"/>
-          <w:sz w:val="28"/>
-        </w:rPr>
-        <w:t xml:space="preserve">      </w:t>
-      </w:r>
-      <w:r>
-        <w:rPr>
-          <w:rFonts w:ascii="FreeMono" w:hAnsi="FreeMono"/>
-          <w:sz w:val="28"/>
-        </w:rPr>
-        <w:t>(let [(num 0)] ; how many times this let is run</w:t>
-      </w:r>
-    </w:p>
-    <w:p>
-      <w:pPr>
-        <w:pStyle w:val="Normal"/>
-        <w:rPr>
-          <w:rFonts w:ascii="FreeMono" w:hAnsi="FreeMono"/>
-        </w:rPr>
-      </w:pPr>
-      <w:r>
-        <w:rPr>
-          <w:rFonts w:ascii="FreeMono" w:hAnsi="FreeMono"/>
-          <w:sz w:val="28"/>
-        </w:rPr>
-        <w:t xml:space="preserve">        </w:t>
-      </w:r>
-      <w:r>
-        <w:rPr>
-          <w:rFonts w:ascii="FreeMono" w:hAnsi="FreeMono"/>
-          <w:sz w:val="28"/>
-        </w:rPr>
-        <w:t>(lambda ()</w:t>
-      </w:r>
-    </w:p>
-    <w:p>
-      <w:pPr>
-        <w:pStyle w:val="Normal"/>
-        <w:rPr>
-          <w:rFonts w:ascii="FreeMono" w:hAnsi="FreeMono"/>
-        </w:rPr>
-      </w:pPr>
-      <w:r>
-        <w:rPr>
-          <w:rFonts w:ascii="FreeMono" w:hAnsi="FreeMono"/>
-          <w:sz w:val="28"/>
-        </w:rPr>
-        <w:t xml:space="preserve">          </w:t>
-      </w:r>
-      <w:r>
-        <w:rPr>
-          <w:rFonts w:ascii="FreeMono" w:hAnsi="FreeMono"/>
-          <w:sz w:val="28"/>
-        </w:rPr>
-        <w:t>(if (zero? supply) 'supply-empty</w:t>
-      </w:r>
-    </w:p>
-    <w:p>
-      <w:pPr>
-        <w:pStyle w:val="Normal"/>
-        <w:rPr>
-          <w:rFonts w:ascii="FreeMono" w:hAnsi="FreeMono"/>
-        </w:rPr>
-      </w:pPr>
-      <w:r>
-        <w:rPr>
-          <w:rFonts w:ascii="FreeMono" w:hAnsi="FreeMono"/>
-          <w:sz w:val="28"/>
-        </w:rPr>
-        <w:t xml:space="preserve">              </w:t>
-      </w:r>
-      <w:r>
-        <w:rPr>
-          <w:rFonts w:ascii="FreeMono" w:hAnsi="FreeMono"/>
-          <w:sz w:val="28"/>
-        </w:rPr>
-        <w:t>(begin</w:t>
-      </w:r>
-    </w:p>
-    <w:p>
-      <w:pPr>
-        <w:pStyle w:val="Normal"/>
-        <w:rPr>
-          <w:rFonts w:ascii="FreeMono" w:hAnsi="FreeMono"/>
-        </w:rPr>
-      </w:pPr>
-      <w:r>
-        <w:rPr>
-          <w:rFonts w:ascii="FreeMono" w:hAnsi="FreeMono"/>
-          <w:sz w:val="28"/>
-        </w:rPr>
-        <w:t xml:space="preserve">                </w:t>
-      </w:r>
-      <w:r>
-        <w:rPr>
-          <w:rFonts w:ascii="FreeMono" w:hAnsi="FreeMono"/>
-          <w:sz w:val="28"/>
-        </w:rPr>
-        <w:t>(set! num (add1 num))</w:t>
-      </w:r>
-    </w:p>
-    <w:p>
-      <w:pPr>
-        <w:pStyle w:val="Normal"/>
-        <w:rPr>
-          <w:rFonts w:ascii="FreeMono" w:hAnsi="FreeMono"/>
-        </w:rPr>
-      </w:pPr>
-      <w:r>
-        <w:rPr>
-          <w:rFonts w:ascii="FreeMono" w:hAnsi="FreeMono"/>
-          <w:sz w:val="28"/>
-        </w:rPr>
-        <w:t xml:space="preserve">                </w:t>
-      </w:r>
-      <w:r>
-        <w:rPr>
-          <w:rFonts w:ascii="FreeMono" w:hAnsi="FreeMono"/>
-          <w:sz w:val="28"/>
-        </w:rPr>
-        <w:t>(set! supply (sub1 supply))</w:t>
-      </w:r>
-    </w:p>
-    <w:p>
-      <w:pPr>
-        <w:pStyle w:val="Normal"/>
-        <w:rPr>
-          <w:rFonts w:ascii="FreeMono" w:hAnsi="FreeMono"/>
-        </w:rPr>
-      </w:pPr>
-      <w:r>
-        <w:rPr>
-          <w:rFonts w:ascii="FreeMono" w:hAnsi="FreeMono"/>
-          <w:sz w:val="28"/>
-        </w:rPr>
-        <w:t xml:space="preserve">                </w:t>
-      </w:r>
-      <w:r>
-        <w:rPr>
-          <w:rFonts w:ascii="FreeMono" w:hAnsi="FreeMono"/>
-          <w:sz w:val="28"/>
-        </w:rPr>
-        <w:t>(list supply num))))))))</w:t>
-      </w:r>
-    </w:p>
-    <w:p>
-      <w:pPr>
-        <w:pStyle w:val="Normal"/>
-        <w:rPr>
-          <w:rFonts w:ascii="FreeMono" w:hAnsi="FreeMono"/>
-        </w:rPr>
-      </w:pPr>
-      <w:r>
-        <w:rPr>
-          <w:rFonts w:ascii="FreeMono" w:hAnsi="FreeMono"/>
-          <w:sz w:val="28"/>
-        </w:rPr>
-      </w:r>
-    </w:p>
-    <w:p>
-      <w:pPr>
-        <w:pStyle w:val="Normal"/>
-        <w:rPr>
-          <w:rFonts w:ascii="FreeMono" w:hAnsi="FreeMono"/>
-        </w:rPr>
-      </w:pPr>
-      <w:r>
-        <w:rPr>
-          <w:rFonts w:ascii="FreeMono" w:hAnsi="FreeMono"/>
-          <w:sz w:val="28"/>
-        </w:rPr>
-        <w:t>(define wc1 (make-weird-counter))</w:t>
+        <w:t>(let ((make-count-down</w:t>
+      </w:r>
+    </w:p>
+    <w:p>
+      <w:pPr>
+        <w:pStyle w:val="Normal"/>
+        <w:rPr>
+          <w:rFonts w:ascii="FreeMono" w:hAnsi="FreeMono"/>
+        </w:rPr>
+      </w:pPr>
+      <w:r>
+        <w:rPr>
+          <w:rFonts w:ascii="FreeMono" w:hAnsi="FreeMono"/>
+          <w:sz w:val="28"/>
+        </w:rPr>
+        <w:t xml:space="preserve">       </w:t>
+      </w:r>
+      <w:r>
+        <w:rPr>
+          <w:rFonts w:ascii="FreeMono" w:hAnsi="FreeMono"/>
+          <w:sz w:val="28"/>
+        </w:rPr>
+        <w:t>(lambda (init)</w:t>
+      </w:r>
+    </w:p>
+    <w:p>
+      <w:pPr>
+        <w:pStyle w:val="Normal"/>
+        <w:rPr>
+          <w:rFonts w:ascii="FreeMono" w:hAnsi="FreeMono"/>
+        </w:rPr>
+      </w:pPr>
+      <w:r>
+        <w:rPr>
+          <w:rFonts w:ascii="FreeMono" w:hAnsi="FreeMono"/>
+          <w:sz w:val="28"/>
+        </w:rPr>
+        <w:t xml:space="preserve">         </w:t>
+      </w:r>
+      <w:r>
+        <w:rPr>
+          <w:rFonts w:ascii="FreeMono" w:hAnsi="FreeMono"/>
+          <w:sz w:val="28"/>
+        </w:rPr>
+        <w:t xml:space="preserve">(let [(num init)] </w:t>
+      </w:r>
+    </w:p>
+    <w:p>
+      <w:pPr>
+        <w:pStyle w:val="Normal"/>
+        <w:rPr>
+          <w:rFonts w:ascii="FreeMono" w:hAnsi="FreeMono"/>
+        </w:rPr>
+      </w:pPr>
+      <w:r>
+        <w:rPr>
+          <w:rFonts w:ascii="FreeMono" w:hAnsi="FreeMono"/>
+          <w:sz w:val="28"/>
+        </w:rPr>
+        <w:t xml:space="preserve">           </w:t>
+      </w:r>
+      <w:r>
+        <w:rPr>
+          <w:rFonts w:ascii="FreeMono" w:hAnsi="FreeMono"/>
+          <w:sz w:val="28"/>
+        </w:rPr>
+        <w:t>(lambda (deduct)</w:t>
+      </w:r>
+    </w:p>
+    <w:p>
+      <w:pPr>
+        <w:pStyle w:val="Normal"/>
+        <w:rPr>
+          <w:rFonts w:ascii="FreeMono" w:hAnsi="FreeMono"/>
+        </w:rPr>
+      </w:pPr>
+      <w:r>
+        <w:rPr>
+          <w:rFonts w:ascii="FreeMono" w:hAnsi="FreeMono"/>
+          <w:sz w:val="28"/>
+        </w:rPr>
+        <w:t xml:space="preserve">             </w:t>
+      </w:r>
+      <w:r>
+        <w:rPr>
+          <w:rFonts w:ascii="FreeMono" w:hAnsi="FreeMono"/>
+          <w:sz w:val="28"/>
+        </w:rPr>
+        <w:t>(set! num (- num deduct))</w:t>
+      </w:r>
+    </w:p>
+    <w:p>
+      <w:pPr>
+        <w:pStyle w:val="Normal"/>
+        <w:rPr>
+          <w:rFonts w:ascii="FreeMono" w:hAnsi="FreeMono"/>
+        </w:rPr>
+      </w:pPr>
+      <w:r>
+        <w:rPr>
+          <w:rFonts w:ascii="FreeMono" w:hAnsi="FreeMono"/>
+          <w:sz w:val="28"/>
+        </w:rPr>
+        <w:t xml:space="preserve">             </w:t>
+      </w:r>
+      <w:r>
+        <w:rPr>
+          <w:rFonts w:ascii="FreeMono" w:hAnsi="FreeMono"/>
+          <w:sz w:val="28"/>
+        </w:rPr>
+        <w:t>num)))))</w:t>
+      </w:r>
+    </w:p>
+    <w:p>
+      <w:pPr>
+        <w:pStyle w:val="Normal"/>
+        <w:rPr>
+          <w:rFonts w:ascii="FreeMono" w:hAnsi="FreeMono"/>
+        </w:rPr>
+      </w:pPr>
+      <w:r>
+        <w:rPr>
+          <w:rFonts w:ascii="FreeMono" w:hAnsi="FreeMono"/>
+          <w:sz w:val="28"/>
+        </w:rPr>
+        <w:t xml:space="preserve">       </w:t>
+      </w:r>
+      <w:r>
+        <w:rPr>
+          <w:rFonts w:ascii="FreeMono" w:hAnsi="FreeMono"/>
+          <w:sz w:val="28"/>
+        </w:rPr>
+        <w:t>(let ((cd1 (make-count-down 100))</w:t>
+      </w:r>
+    </w:p>
+    <w:p>
+      <w:pPr>
+        <w:pStyle w:val="Normal"/>
+        <w:rPr>
+          <w:rFonts w:ascii="FreeMono" w:hAnsi="FreeMono"/>
+        </w:rPr>
+      </w:pPr>
+      <w:r>
+        <w:rPr>
+          <w:rFonts w:ascii="FreeMono" w:hAnsi="FreeMono"/>
+          <w:sz w:val="28"/>
+        </w:rPr>
+        <w:t xml:space="preserve">             </w:t>
+      </w:r>
+      <w:r>
+        <w:rPr>
+          <w:rFonts w:ascii="FreeMono" w:hAnsi="FreeMono"/>
+          <w:sz w:val="28"/>
+        </w:rPr>
+        <w:t>(cd2 (make-count-down 100)))</w:t>
       </w:r>
     </w:p>
     <w:p>
@@ -1074,7 +1001,14 @@
           <w:rFonts w:ascii="FreeMono" w:hAnsi="FreeMono"/>
           <w:sz w:val="28"/>
         </w:rPr>
-        <w:t>(wc1)</w:t>
+        <w:t xml:space="preserve">         </w:t>
+      </w:r>
+      <w:r>
+        <w:rPr>
+          <w:rFonts w:ascii="FreeMono" w:hAnsi="FreeMono"/>
+          <w:sz w:val="28"/>
+        </w:rPr>
+        <w:t>(cd1 5)))</w:t>
       </w:r>
     </w:p>
     <w:sectPr>

</xml_diff>